<commit_message>
Fix cell merging across all 7 columns for section banners and remove linebreaks in survey letter
</commit_message>
<xml_diff>
--- a/Phieu_Khao_Sat_Chinh_Thuc_VietinBank.docx
+++ b/Phieu_Khao_Sat_Chinh_Thuc_VietinBank.docx
@@ -64,21 +64,49 @@
     </w:p>
     <w:p>
       <w:pPr>
-        <w:spacing w:line="276" w:lineRule="auto" w:after="280"/>
-        <w:ind w:left="288" w:right="288"/>
+        <w:spacing w:after="80"/>
+      </w:pPr>
+      <w:r>
+        <w:rPr>
+          <w:b/>
+          <w:i/>
+        </w:rPr>
+        <w:t>Kính gửi: Quý Doanh nghiệp,</w:t>
+      </w:r>
+    </w:p>
+    <w:p>
+      <w:pPr>
+        <w:spacing w:line="276" w:lineRule="auto" w:after="80"/>
         <w:jc w:val="both"/>
       </w:pPr>
       <w:r>
         <w:rPr>
           <w:i/>
-          <w:sz w:val="21"/>
         </w:rPr>
-        <w:t>Kính gửi: Quý Doanh nghiệp,</w:t>
-        <w:br/>
         <w:t>Nhằm nâng cao chất lượng dịch vụ, tối ưu hóa quy trình và thiết kế các gói sản phẩm bảo lãnh đáp ứng tốt nhất nhu cầu của Quý Doanh nghiệp, VietinBank tiến hành cuộc khảo sát này. Kính mong Quý Doanh nghiệp dành chút thời gian quý báu để đưa ra những đánh giá khách quan.</w:t>
-        <w:br/>
+      </w:r>
+    </w:p>
+    <w:p>
+      <w:pPr>
+        <w:spacing w:line="276" w:lineRule="auto" w:after="80"/>
+        <w:jc w:val="both"/>
+      </w:pPr>
+      <w:r>
+        <w:rPr>
+          <w:i/>
+        </w:rPr>
         <w:t>VietinBank cam kết toàn bộ thông tin do Quý Doanh nghiệp cung cấp sẽ được giữ bí mật tuyệt đối và chỉ sử dụng cho mục đích phân tích tổng hợp.</w:t>
-        <w:br/>
+      </w:r>
+    </w:p>
+    <w:p>
+      <w:pPr>
+        <w:spacing w:after="280"/>
+      </w:pPr>
+      <w:r>
+        <w:rPr>
+          <w:b/>
+          <w:i/>
+        </w:rPr>
         <w:t>Xin chân thành cảm ơn sự hợp tác của Quý Doanh nghiệp!</w:t>
       </w:r>
     </w:p>
@@ -411,7 +439,8 @@
       <w:tr>
         <w:tc>
           <w:tcPr>
-            <w:tcW w:type="dxa" w:w="1152"/>
+            <w:tcW w:type="dxa" w:w="9359"/>
+            <w:gridSpan w:val="7"/>
             <w:tcMar>
               <w:top w:w="100" w:type="dxa"/>
               <w:bottom w:w="100" w:type="dxa"/>
@@ -431,47 +460,12 @@
             </w:r>
           </w:p>
         </w:tc>
-        <w:tc>
-          <w:tcPr>
-            <w:tcW w:type="dxa" w:w="5904"/>
-          </w:tcPr>
-          <w:p/>
-        </w:tc>
-        <w:tc>
-          <w:tcPr>
-            <w:tcW w:type="dxa" w:w="504"/>
-          </w:tcPr>
-          <w:p/>
-        </w:tc>
-        <w:tc>
-          <w:tcPr>
-            <w:tcW w:type="dxa" w:w="504"/>
-          </w:tcPr>
-          <w:p/>
-        </w:tc>
-        <w:tc>
-          <w:tcPr>
-            <w:tcW w:type="dxa" w:w="504"/>
-          </w:tcPr>
-          <w:p/>
-        </w:tc>
-        <w:tc>
-          <w:tcPr>
-            <w:tcW w:type="dxa" w:w="504"/>
-          </w:tcPr>
-          <w:p/>
-        </w:tc>
-        <w:tc>
-          <w:tcPr>
-            <w:tcW w:type="dxa" w:w="504"/>
-          </w:tcPr>
-          <w:p/>
-        </w:tc>
       </w:tr>
       <w:tr>
         <w:tc>
           <w:tcPr>
-            <w:tcW w:type="dxa" w:w="1152"/>
+            <w:tcW w:type="dxa" w:w="9359"/>
+            <w:gridSpan w:val="7"/>
             <w:tcMar>
               <w:top w:w="80" w:type="dxa"/>
               <w:bottom w:w="80" w:type="dxa"/>
@@ -489,42 +483,6 @@
               <w:t>I. Chi phí &amp; Biểu phí bảo lãnh (COST)</w:t>
             </w:r>
           </w:p>
-        </w:tc>
-        <w:tc>
-          <w:tcPr>
-            <w:tcW w:type="dxa" w:w="5904"/>
-          </w:tcPr>
-          <w:p/>
-        </w:tc>
-        <w:tc>
-          <w:tcPr>
-            <w:tcW w:type="dxa" w:w="504"/>
-          </w:tcPr>
-          <w:p/>
-        </w:tc>
-        <w:tc>
-          <w:tcPr>
-            <w:tcW w:type="dxa" w:w="504"/>
-          </w:tcPr>
-          <w:p/>
-        </w:tc>
-        <w:tc>
-          <w:tcPr>
-            <w:tcW w:type="dxa" w:w="504"/>
-          </w:tcPr>
-          <w:p/>
-        </w:tc>
-        <w:tc>
-          <w:tcPr>
-            <w:tcW w:type="dxa" w:w="504"/>
-          </w:tcPr>
-          <w:p/>
-        </w:tc>
-        <w:tc>
-          <w:tcPr>
-            <w:tcW w:type="dxa" w:w="504"/>
-          </w:tcPr>
-          <w:p/>
         </w:tc>
       </w:tr>
       <w:tr>
@@ -947,7 +905,8 @@
       <w:tr>
         <w:tc>
           <w:tcPr>
-            <w:tcW w:type="dxa" w:w="1152"/>
+            <w:tcW w:type="dxa" w:w="9359"/>
+            <w:gridSpan w:val="7"/>
             <w:tcMar>
               <w:top w:w="80" w:type="dxa"/>
               <w:bottom w:w="80" w:type="dxa"/>
@@ -965,42 +924,6 @@
               <w:t>II. Yêu cầu Tài sản đảm bảo &amp; Tỷ lệ Ký quỹ (COL)</w:t>
             </w:r>
           </w:p>
-        </w:tc>
-        <w:tc>
-          <w:tcPr>
-            <w:tcW w:type="dxa" w:w="5904"/>
-          </w:tcPr>
-          <w:p/>
-        </w:tc>
-        <w:tc>
-          <w:tcPr>
-            <w:tcW w:type="dxa" w:w="504"/>
-          </w:tcPr>
-          <w:p/>
-        </w:tc>
-        <w:tc>
-          <w:tcPr>
-            <w:tcW w:type="dxa" w:w="504"/>
-          </w:tcPr>
-          <w:p/>
-        </w:tc>
-        <w:tc>
-          <w:tcPr>
-            <w:tcW w:type="dxa" w:w="504"/>
-          </w:tcPr>
-          <w:p/>
-        </w:tc>
-        <w:tc>
-          <w:tcPr>
-            <w:tcW w:type="dxa" w:w="504"/>
-          </w:tcPr>
-          <w:p/>
-        </w:tc>
-        <w:tc>
-          <w:tcPr>
-            <w:tcW w:type="dxa" w:w="504"/>
-          </w:tcPr>
-          <w:p/>
         </w:tc>
       </w:tr>
       <w:tr>
@@ -1423,7 +1346,8 @@
       <w:tr>
         <w:tc>
           <w:tcPr>
-            <w:tcW w:type="dxa" w:w="1152"/>
+            <w:tcW w:type="dxa" w:w="9359"/>
+            <w:gridSpan w:val="7"/>
             <w:tcMar>
               <w:top w:w="80" w:type="dxa"/>
               <w:bottom w:w="80" w:type="dxa"/>
@@ -1441,42 +1365,6 @@
               <w:t>III. Thời gian &amp; Tốc độ xử lý hồ sơ (SPE)</w:t>
             </w:r>
           </w:p>
-        </w:tc>
-        <w:tc>
-          <w:tcPr>
-            <w:tcW w:type="dxa" w:w="5904"/>
-          </w:tcPr>
-          <w:p/>
-        </w:tc>
-        <w:tc>
-          <w:tcPr>
-            <w:tcW w:type="dxa" w:w="504"/>
-          </w:tcPr>
-          <w:p/>
-        </w:tc>
-        <w:tc>
-          <w:tcPr>
-            <w:tcW w:type="dxa" w:w="504"/>
-          </w:tcPr>
-          <w:p/>
-        </w:tc>
-        <w:tc>
-          <w:tcPr>
-            <w:tcW w:type="dxa" w:w="504"/>
-          </w:tcPr>
-          <w:p/>
-        </w:tc>
-        <w:tc>
-          <w:tcPr>
-            <w:tcW w:type="dxa" w:w="504"/>
-          </w:tcPr>
-          <w:p/>
-        </w:tc>
-        <w:tc>
-          <w:tcPr>
-            <w:tcW w:type="dxa" w:w="504"/>
-          </w:tcPr>
-          <w:p/>
         </w:tc>
       </w:tr>
       <w:tr>
@@ -1899,7 +1787,8 @@
       <w:tr>
         <w:tc>
           <w:tcPr>
-            <w:tcW w:type="dxa" w:w="1152"/>
+            <w:tcW w:type="dxa" w:w="9359"/>
+            <w:gridSpan w:val="7"/>
             <w:tcMar>
               <w:top w:w="80" w:type="dxa"/>
               <w:bottom w:w="80" w:type="dxa"/>
@@ -1917,42 +1806,6 @@
               <w:t>IV. Uy tín &amp; Thương hiệu VietinBank (REP)</w:t>
             </w:r>
           </w:p>
-        </w:tc>
-        <w:tc>
-          <w:tcPr>
-            <w:tcW w:type="dxa" w:w="5904"/>
-          </w:tcPr>
-          <w:p/>
-        </w:tc>
-        <w:tc>
-          <w:tcPr>
-            <w:tcW w:type="dxa" w:w="504"/>
-          </w:tcPr>
-          <w:p/>
-        </w:tc>
-        <w:tc>
-          <w:tcPr>
-            <w:tcW w:type="dxa" w:w="504"/>
-          </w:tcPr>
-          <w:p/>
-        </w:tc>
-        <w:tc>
-          <w:tcPr>
-            <w:tcW w:type="dxa" w:w="504"/>
-          </w:tcPr>
-          <w:p/>
-        </w:tc>
-        <w:tc>
-          <w:tcPr>
-            <w:tcW w:type="dxa" w:w="504"/>
-          </w:tcPr>
-          <w:p/>
-        </w:tc>
-        <w:tc>
-          <w:tcPr>
-            <w:tcW w:type="dxa" w:w="504"/>
-          </w:tcPr>
-          <w:p/>
         </w:tc>
       </w:tr>
       <w:tr>
@@ -2375,7 +2228,8 @@
       <w:tr>
         <w:tc>
           <w:tcPr>
-            <w:tcW w:type="dxa" w:w="1152"/>
+            <w:tcW w:type="dxa" w:w="9359"/>
+            <w:gridSpan w:val="7"/>
             <w:tcMar>
               <w:top w:w="80" w:type="dxa"/>
               <w:bottom w:w="80" w:type="dxa"/>
@@ -2393,42 +2247,6 @@
               <w:t>V. Trình độ &amp; Thái độ phục vụ của Cán bộ (STA)</w:t>
             </w:r>
           </w:p>
-        </w:tc>
-        <w:tc>
-          <w:tcPr>
-            <w:tcW w:type="dxa" w:w="5904"/>
-          </w:tcPr>
-          <w:p/>
-        </w:tc>
-        <w:tc>
-          <w:tcPr>
-            <w:tcW w:type="dxa" w:w="504"/>
-          </w:tcPr>
-          <w:p/>
-        </w:tc>
-        <w:tc>
-          <w:tcPr>
-            <w:tcW w:type="dxa" w:w="504"/>
-          </w:tcPr>
-          <w:p/>
-        </w:tc>
-        <w:tc>
-          <w:tcPr>
-            <w:tcW w:type="dxa" w:w="504"/>
-          </w:tcPr>
-          <w:p/>
-        </w:tc>
-        <w:tc>
-          <w:tcPr>
-            <w:tcW w:type="dxa" w:w="504"/>
-          </w:tcPr>
-          <w:p/>
-        </w:tc>
-        <w:tc>
-          <w:tcPr>
-            <w:tcW w:type="dxa" w:w="504"/>
-          </w:tcPr>
-          <w:p/>
         </w:tc>
       </w:tr>
       <w:tr>
@@ -2851,7 +2669,8 @@
       <w:tr>
         <w:tc>
           <w:tcPr>
-            <w:tcW w:type="dxa" w:w="1152"/>
+            <w:tcW w:type="dxa" w:w="9359"/>
+            <w:gridSpan w:val="7"/>
             <w:tcMar>
               <w:top w:w="80" w:type="dxa"/>
               <w:bottom w:w="80" w:type="dxa"/>
@@ -2869,42 +2688,6 @@
               <w:t>VI. Mối quan hệ tín dụng sẵn có (REL)</w:t>
             </w:r>
           </w:p>
-        </w:tc>
-        <w:tc>
-          <w:tcPr>
-            <w:tcW w:type="dxa" w:w="5904"/>
-          </w:tcPr>
-          <w:p/>
-        </w:tc>
-        <w:tc>
-          <w:tcPr>
-            <w:tcW w:type="dxa" w:w="504"/>
-          </w:tcPr>
-          <w:p/>
-        </w:tc>
-        <w:tc>
-          <w:tcPr>
-            <w:tcW w:type="dxa" w:w="504"/>
-          </w:tcPr>
-          <w:p/>
-        </w:tc>
-        <w:tc>
-          <w:tcPr>
-            <w:tcW w:type="dxa" w:w="504"/>
-          </w:tcPr>
-          <w:p/>
-        </w:tc>
-        <w:tc>
-          <w:tcPr>
-            <w:tcW w:type="dxa" w:w="504"/>
-          </w:tcPr>
-          <w:p/>
-        </w:tc>
-        <w:tc>
-          <w:tcPr>
-            <w:tcW w:type="dxa" w:w="504"/>
-          </w:tcPr>
-          <w:p/>
         </w:tc>
       </w:tr>
       <w:tr>
@@ -3327,7 +3110,8 @@
       <w:tr>
         <w:tc>
           <w:tcPr>
-            <w:tcW w:type="dxa" w:w="1152"/>
+            <w:tcW w:type="dxa" w:w="9359"/>
+            <w:gridSpan w:val="7"/>
             <w:tcMar>
               <w:top w:w="80" w:type="dxa"/>
               <w:bottom w:w="80" w:type="dxa"/>
@@ -3345,42 +3129,6 @@
               <w:t>VII. Mức độ Chuyển đổi số &amp; Bảo lãnh điện tử (DIG - Biến mới 1)</w:t>
             </w:r>
           </w:p>
-        </w:tc>
-        <w:tc>
-          <w:tcPr>
-            <w:tcW w:type="dxa" w:w="5904"/>
-          </w:tcPr>
-          <w:p/>
-        </w:tc>
-        <w:tc>
-          <w:tcPr>
-            <w:tcW w:type="dxa" w:w="504"/>
-          </w:tcPr>
-          <w:p/>
-        </w:tc>
-        <w:tc>
-          <w:tcPr>
-            <w:tcW w:type="dxa" w:w="504"/>
-          </w:tcPr>
-          <w:p/>
-        </w:tc>
-        <w:tc>
-          <w:tcPr>
-            <w:tcW w:type="dxa" w:w="504"/>
-          </w:tcPr>
-          <w:p/>
-        </w:tc>
-        <w:tc>
-          <w:tcPr>
-            <w:tcW w:type="dxa" w:w="504"/>
-          </w:tcPr>
-          <w:p/>
-        </w:tc>
-        <w:tc>
-          <w:tcPr>
-            <w:tcW w:type="dxa" w:w="504"/>
-          </w:tcPr>
-          <w:p/>
         </w:tc>
       </w:tr>
       <w:tr>
@@ -3803,7 +3551,8 @@
       <w:tr>
         <w:tc>
           <w:tcPr>
-            <w:tcW w:type="dxa" w:w="1152"/>
+            <w:tcW w:type="dxa" w:w="9359"/>
+            <w:gridSpan w:val="7"/>
             <w:tcMar>
               <w:top w:w="80" w:type="dxa"/>
               <w:bottom w:w="80" w:type="dxa"/>
@@ -3821,42 +3570,6 @@
               <w:t>VIII. Thiết kế Giải pháp Bảo lãnh theo yêu cầu (CUS - Biến mới 2)</w:t>
             </w:r>
           </w:p>
-        </w:tc>
-        <w:tc>
-          <w:tcPr>
-            <w:tcW w:type="dxa" w:w="5904"/>
-          </w:tcPr>
-          <w:p/>
-        </w:tc>
-        <w:tc>
-          <w:tcPr>
-            <w:tcW w:type="dxa" w:w="504"/>
-          </w:tcPr>
-          <w:p/>
-        </w:tc>
-        <w:tc>
-          <w:tcPr>
-            <w:tcW w:type="dxa" w:w="504"/>
-          </w:tcPr>
-          <w:p/>
-        </w:tc>
-        <w:tc>
-          <w:tcPr>
-            <w:tcW w:type="dxa" w:w="504"/>
-          </w:tcPr>
-          <w:p/>
-        </w:tc>
-        <w:tc>
-          <w:tcPr>
-            <w:tcW w:type="dxa" w:w="504"/>
-          </w:tcPr>
-          <w:p/>
-        </w:tc>
-        <w:tc>
-          <w:tcPr>
-            <w:tcW w:type="dxa" w:w="504"/>
-          </w:tcPr>
-          <w:p/>
         </w:tc>
       </w:tr>
       <w:tr>
@@ -4279,7 +3992,8 @@
       <w:tr>
         <w:tc>
           <w:tcPr>
-            <w:tcW w:type="dxa" w:w="1152"/>
+            <w:tcW w:type="dxa" w:w="9359"/>
+            <w:gridSpan w:val="7"/>
             <w:tcMar>
               <w:top w:w="80" w:type="dxa"/>
               <w:bottom w:w="80" w:type="dxa"/>
@@ -4297,42 +4011,6 @@
               <w:t>IX. Năng lực Tư vấn Pháp lý &amp; Quản trị Rủi ro (RSK - Biến mới 3)</w:t>
             </w:r>
           </w:p>
-        </w:tc>
-        <w:tc>
-          <w:tcPr>
-            <w:tcW w:type="dxa" w:w="5904"/>
-          </w:tcPr>
-          <w:p/>
-        </w:tc>
-        <w:tc>
-          <w:tcPr>
-            <w:tcW w:type="dxa" w:w="504"/>
-          </w:tcPr>
-          <w:p/>
-        </w:tc>
-        <w:tc>
-          <w:tcPr>
-            <w:tcW w:type="dxa" w:w="504"/>
-          </w:tcPr>
-          <w:p/>
-        </w:tc>
-        <w:tc>
-          <w:tcPr>
-            <w:tcW w:type="dxa" w:w="504"/>
-          </w:tcPr>
-          <w:p/>
-        </w:tc>
-        <w:tc>
-          <w:tcPr>
-            <w:tcW w:type="dxa" w:w="504"/>
-          </w:tcPr>
-          <w:p/>
-        </w:tc>
-        <w:tc>
-          <w:tcPr>
-            <w:tcW w:type="dxa" w:w="504"/>
-          </w:tcPr>
-          <w:p/>
         </w:tc>
       </w:tr>
       <w:tr>
@@ -4755,7 +4433,8 @@
       <w:tr>
         <w:tc>
           <w:tcPr>
-            <w:tcW w:type="dxa" w:w="1152"/>
+            <w:tcW w:type="dxa" w:w="9359"/>
+            <w:gridSpan w:val="7"/>
             <w:tcMar>
               <w:top w:w="80" w:type="dxa"/>
               <w:bottom w:w="80" w:type="dxa"/>
@@ -4773,42 +4452,6 @@
               <w:t>X. Mạng lưới Ngân hàng Đại lý Quốc tế (NET - Biến mới 4)</w:t>
             </w:r>
           </w:p>
-        </w:tc>
-        <w:tc>
-          <w:tcPr>
-            <w:tcW w:type="dxa" w:w="5904"/>
-          </w:tcPr>
-          <w:p/>
-        </w:tc>
-        <w:tc>
-          <w:tcPr>
-            <w:tcW w:type="dxa" w:w="504"/>
-          </w:tcPr>
-          <w:p/>
-        </w:tc>
-        <w:tc>
-          <w:tcPr>
-            <w:tcW w:type="dxa" w:w="504"/>
-          </w:tcPr>
-          <w:p/>
-        </w:tc>
-        <w:tc>
-          <w:tcPr>
-            <w:tcW w:type="dxa" w:w="504"/>
-          </w:tcPr>
-          <w:p/>
-        </w:tc>
-        <w:tc>
-          <w:tcPr>
-            <w:tcW w:type="dxa" w:w="504"/>
-          </w:tcPr>
-          <w:p/>
-        </w:tc>
-        <w:tc>
-          <w:tcPr>
-            <w:tcW w:type="dxa" w:w="504"/>
-          </w:tcPr>
-          <w:p/>
         </w:tc>
       </w:tr>
       <w:tr>
@@ -5231,7 +4874,8 @@
       <w:tr>
         <w:tc>
           <w:tcPr>
-            <w:tcW w:type="dxa" w:w="1152"/>
+            <w:tcW w:type="dxa" w:w="9359"/>
+            <w:gridSpan w:val="7"/>
             <w:tcMar>
               <w:top w:w="100" w:type="dxa"/>
               <w:bottom w:w="100" w:type="dxa"/>
@@ -5251,47 +4895,12 @@
             </w:r>
           </w:p>
         </w:tc>
-        <w:tc>
-          <w:tcPr>
-            <w:tcW w:type="dxa" w:w="5904"/>
-          </w:tcPr>
-          <w:p/>
-        </w:tc>
-        <w:tc>
-          <w:tcPr>
-            <w:tcW w:type="dxa" w:w="504"/>
-          </w:tcPr>
-          <w:p/>
-        </w:tc>
-        <w:tc>
-          <w:tcPr>
-            <w:tcW w:type="dxa" w:w="504"/>
-          </w:tcPr>
-          <w:p/>
-        </w:tc>
-        <w:tc>
-          <w:tcPr>
-            <w:tcW w:type="dxa" w:w="504"/>
-          </w:tcPr>
-          <w:p/>
-        </w:tc>
-        <w:tc>
-          <w:tcPr>
-            <w:tcW w:type="dxa" w:w="504"/>
-          </w:tcPr>
-          <w:p/>
-        </w:tc>
-        <w:tc>
-          <w:tcPr>
-            <w:tcW w:type="dxa" w:w="504"/>
-          </w:tcPr>
-          <w:p/>
-        </w:tc>
       </w:tr>
       <w:tr>
         <w:tc>
           <w:tcPr>
-            <w:tcW w:type="dxa" w:w="1152"/>
+            <w:tcW w:type="dxa" w:w="9359"/>
+            <w:gridSpan w:val="7"/>
             <w:tcMar>
               <w:top w:w="80" w:type="dxa"/>
               <w:bottom w:w="80" w:type="dxa"/>
@@ -5309,42 +4918,6 @@
               <w:t>XI. Quyết định Lựa chọn &amp; Sự hài lòng của Doanh nghiệp (DEC)</w:t>
             </w:r>
           </w:p>
-        </w:tc>
-        <w:tc>
-          <w:tcPr>
-            <w:tcW w:type="dxa" w:w="5904"/>
-          </w:tcPr>
-          <w:p/>
-        </w:tc>
-        <w:tc>
-          <w:tcPr>
-            <w:tcW w:type="dxa" w:w="504"/>
-          </w:tcPr>
-          <w:p/>
-        </w:tc>
-        <w:tc>
-          <w:tcPr>
-            <w:tcW w:type="dxa" w:w="504"/>
-          </w:tcPr>
-          <w:p/>
-        </w:tc>
-        <w:tc>
-          <w:tcPr>
-            <w:tcW w:type="dxa" w:w="504"/>
-          </w:tcPr>
-          <w:p/>
-        </w:tc>
-        <w:tc>
-          <w:tcPr>
-            <w:tcW w:type="dxa" w:w="504"/>
-          </w:tcPr>
-          <w:p/>
-        </w:tc>
-        <w:tc>
-          <w:tcPr>
-            <w:tcW w:type="dxa" w:w="504"/>
-          </w:tcPr>
-          <w:p/>
         </w:tc>
       </w:tr>
       <w:tr>

</xml_diff>